<commit_message>
Pushing my first/initial changes to github
</commit_message>
<xml_diff>
--- a/Business Project.docx
+++ b/Business Project.docx
@@ -344,22 +344,6 @@
     </w:p>
     <w:p>
       <w:pPr>
-        <w:ind w:left="360"/>
-        <w:rPr>
-          <w:rFonts w:ascii="Garamond" w:hAnsi="Garamond"/>
-        </w:rPr>
-      </w:pPr>
-    </w:p>
-    <w:p>
-      <w:pPr>
-        <w:ind w:left="360"/>
-        <w:rPr>
-          <w:rFonts w:ascii="Garamond" w:hAnsi="Garamond"/>
-        </w:rPr>
-      </w:pPr>
-    </w:p>
-    <w:p>
-      <w:pPr>
         <w:rPr>
           <w:rFonts w:ascii="Garamond" w:hAnsi="Garamond"/>
           <w:b/>
@@ -385,20 +369,34 @@
         <w:rPr>
           <w:rFonts w:ascii="Garamond" w:hAnsi="Garamond"/>
         </w:rPr>
+        <w:t xml:space="preserve">Midlands Infrastructure Group (MIG) Ltd. is a Tier-1 UK civil engineering and construction company </w:t>
+      </w:r>
+      <w:proofErr w:type="gramStart"/>
+      <w:r>
+        <w:rPr>
+          <w:rFonts w:ascii="Garamond" w:hAnsi="Garamond"/>
+        </w:rPr>
+        <w:t>headquartered</w:t>
+      </w:r>
+      <w:proofErr w:type="gramEnd"/>
+      <w:r>
+        <w:rPr>
+          <w:rFonts w:ascii="Garamond" w:hAnsi="Garamond"/>
+        </w:rPr>
+        <w:t xml:space="preserve"> in Birmingham, England. Founded in 1994 as a regional roadworks contractor, the company has grown strategically over three decades to become a national operator delivering complex infrastructure projects across highways, rail, energy, and utilities sectors.</w:t>
+      </w:r>
+    </w:p>
+    <w:p>
+      <w:pPr>
+        <w:rPr>
+          <w:rFonts w:ascii="Garamond" w:hAnsi="Garamond"/>
+        </w:rPr>
+      </w:pPr>
+      <w:r>
+        <w:rPr>
+          <w:rFonts w:ascii="Garamond" w:hAnsi="Garamond"/>
+        </w:rPr>
         <w:lastRenderedPageBreak/>
-        <w:t>Midlands Infrastructure Group (MIG) Ltd. is a Tier-1 UK civil engineering and construction company headquartered in Birmingham, England. Founded in 1994 as a regional roadworks contractor, the company has grown strategically over three decades to become a national operator delivering complex infrastructure projects across highways, rail, energy, and utilities sectors.</w:t>
-      </w:r>
-    </w:p>
-    <w:p>
-      <w:pPr>
-        <w:rPr>
-          <w:rFonts w:ascii="Garamond" w:hAnsi="Garamond"/>
-        </w:rPr>
-      </w:pPr>
-      <w:r>
-        <w:rPr>
-          <w:rFonts w:ascii="Garamond" w:hAnsi="Garamond"/>
-        </w:rPr>
         <w:t>MIG's growth trajectory reflects a commitment to operational excellence and technological advancement. The 2000s marked the company's expansion into multi-site operations with regional hubs across the UK. In 2012, MIG standardized its planning and cost coding systems, successfully integrating site operations with commercial teams to enhance financial visibility and project controls. A significant milestone occurred in 2018 when the company secured framework agreements with leading cement suppliers, stabilizing material flows and pricing. The digital transformation accelerated in 2021 with the rollout of integrated weighbridge systems and electronic proof-of-delivery (e-POD) tracking tools across all operational sites.</w:t>
       </w:r>
     </w:p>
@@ -412,20 +410,60 @@
         <w:rPr>
           <w:rFonts w:ascii="Garamond" w:hAnsi="Garamond"/>
         </w:rPr>
-        <w:t>Today, MIG manages between 25 and 40 concurrent construction sites, serving a diverse client portfolio that includes government bodies such as the Department for Transport and National Highways, regional councils, and private developers. The company maintains a workforce of approximately 850 employees and generates annual revenues exceeding £350 million, with sustained year-over-year growth. MIG's operational capabilities span full-service civil engineering, groundworks, reinforced concrete structures, and major infrastructure delivery.</w:t>
-      </w:r>
-    </w:p>
-    <w:p>
-      <w:pPr>
-        <w:rPr>
-          <w:rFonts w:ascii="Garamond" w:hAnsi="Garamond"/>
-        </w:rPr>
-      </w:pPr>
-      <w:r>
-        <w:rPr>
-          <w:rFonts w:ascii="Garamond" w:hAnsi="Garamond"/>
-        </w:rPr>
-        <w:t>MIG's competitive advantages are built on three core pillars. First, standardized data capture across all sites ensures consistent operational intelligence. Second, framework agreements with suppliers provide stable pricing and guaranteed material availability. Third, strong digital adoption—including IoT-enabled weighbridges, tablet-based site reporting, and e-POD systems—positions MIG ahead of competitors in operational visibility. Additionally, the company's commitment to sustainability through waste reduction and carbon footprint minimization has become a key differentiator in an increasingly environmentally conscious construction sector.</w:t>
+        <w:t xml:space="preserve">Today, MIG manages between 25 and 40 concurrent construction sites, serving a diverse client portfolio that includes government bodies such as the Department for Transport and National Highways, regional councils, and private developers. The company maintains a workforce of approximately 850 employees and generates annual revenues exceeding £350 million, with sustained year-over-year growth. MIG's operational capabilities span full-service civil engineering, </w:t>
+      </w:r>
+      <w:proofErr w:type="gramStart"/>
+      <w:r>
+        <w:rPr>
+          <w:rFonts w:ascii="Garamond" w:hAnsi="Garamond"/>
+        </w:rPr>
+        <w:t>groundworks</w:t>
+      </w:r>
+      <w:proofErr w:type="gramEnd"/>
+      <w:r>
+        <w:rPr>
+          <w:rFonts w:ascii="Garamond" w:hAnsi="Garamond"/>
+        </w:rPr>
+        <w:t>, reinforced concrete structures, and major infrastructure delivery.</w:t>
+      </w:r>
+    </w:p>
+    <w:p>
+      <w:pPr>
+        <w:rPr>
+          <w:rFonts w:ascii="Garamond" w:hAnsi="Garamond"/>
+        </w:rPr>
+      </w:pPr>
+      <w:r>
+        <w:rPr>
+          <w:rFonts w:ascii="Garamond" w:hAnsi="Garamond"/>
+        </w:rPr>
+        <w:t xml:space="preserve">MIG's competitive advantages are built on three core pillars. </w:t>
+      </w:r>
+    </w:p>
+    <w:p>
+      <w:pPr>
+        <w:rPr>
+          <w:rFonts w:ascii="Garamond" w:hAnsi="Garamond"/>
+        </w:rPr>
+      </w:pPr>
+      <w:r>
+        <w:rPr>
+          <w:rFonts w:ascii="Garamond" w:hAnsi="Garamond"/>
+        </w:rPr>
+        <w:t xml:space="preserve">First, standardized data capture across all sites ensures consistent operational intelligence. </w:t>
+      </w:r>
+    </w:p>
+    <w:p>
+      <w:pPr>
+        <w:rPr>
+          <w:rFonts w:ascii="Garamond" w:hAnsi="Garamond"/>
+        </w:rPr>
+      </w:pPr>
+      <w:r>
+        <w:rPr>
+          <w:rFonts w:ascii="Garamond" w:hAnsi="Garamond"/>
+        </w:rPr>
+        <w:t>Second, framework agreements with suppliers provide stable pricing and guaranteed material availability. Third, strong digital adoption—including IoT-enabled weighbridges, tablet-based site reporting, and e-POD systems—positions MIG ahead of competitors in operational visibility. Additionally, the company's commitment to sustainability through waste reduction and carbon footprint minimization has become a key differentiator in an increasingly environmentally conscious construction sector.</w:t>
       </w:r>
     </w:p>
     <w:p>
@@ -495,20 +533,20 @@
         <w:rPr>
           <w:rFonts w:ascii="Garamond" w:hAnsi="Garamond"/>
         </w:rPr>
+        <w:t>Stockouts and Idle Resources: When cement is unavailable for scheduled pours, crews remain idle while equipment stands unused. This directly impacts project timelines and exposes MIG to contractual penalty clauses.</w:t>
+      </w:r>
+    </w:p>
+    <w:p>
+      <w:pPr>
+        <w:rPr>
+          <w:rFonts w:ascii="Garamond" w:hAnsi="Garamond"/>
+        </w:rPr>
+      </w:pPr>
+      <w:r>
+        <w:rPr>
+          <w:rFonts w:ascii="Garamond" w:hAnsi="Garamond"/>
+        </w:rPr>
         <w:lastRenderedPageBreak/>
-        <w:t>Stockouts and Idle Resources: When cement is unavailable for scheduled pours, crews remain idle while equipment stands unused. This directly impacts project timelines and exposes MIG to contractual penalty clauses.</w:t>
-      </w:r>
-    </w:p>
-    <w:p>
-      <w:pPr>
-        <w:rPr>
-          <w:rFonts w:ascii="Garamond" w:hAnsi="Garamond"/>
-        </w:rPr>
-      </w:pPr>
-      <w:r>
-        <w:rPr>
-          <w:rFonts w:ascii="Garamond" w:hAnsi="Garamond"/>
-        </w:rPr>
         <w:t>Overstocking and Capital Tie-up: Excessive cement inventory strains silo capacity, risks material expiry (particularly for specialized grades), and ties up working capital that could be deployed elsewhere.</w:t>
       </w:r>
     </w:p>
@@ -599,7 +637,21 @@
         <w:rPr>
           <w:rFonts w:ascii="Garamond" w:hAnsi="Garamond"/>
         </w:rPr>
-        <w:t> This project aims to develop a robust demand forecasting system for cement across MIG's multi-site operations. The solution will combine historical consumption patterns, planned pour schedules, real-time inventory positions, and external weather data to generate accurate site-level forecasts. The outputs will drive automated reorder point calculations and silo utilization planning.</w:t>
+        <w:t xml:space="preserve"> This project aims to develop a robust demand forecasting system for cement across MIG's multi-site operations. The solution will combine historical consumption patterns, planned pour schedules, real-time inventory positions, and external weather data to generate accurate site-level forecasts. The outputs will drive automated </w:t>
+      </w:r>
+      <w:proofErr w:type="gramStart"/>
+      <w:r>
+        <w:rPr>
+          <w:rFonts w:ascii="Garamond" w:hAnsi="Garamond"/>
+        </w:rPr>
+        <w:t>reorder</w:t>
+      </w:r>
+      <w:proofErr w:type="gramEnd"/>
+      <w:r>
+        <w:rPr>
+          <w:rFonts w:ascii="Garamond" w:hAnsi="Garamond"/>
+        </w:rPr>
+        <w:t xml:space="preserve"> point calculations and silo utilization planning.</w:t>
       </w:r>
     </w:p>
     <w:p>
@@ -704,7 +756,6 @@
           <w:b/>
           <w:bCs/>
         </w:rPr>
-        <w:lastRenderedPageBreak/>
         <w:t>Cost Optimization:</w:t>
       </w:r>
       <w:r>
@@ -755,6 +806,7 @@
           <w:b/>
           <w:bCs/>
         </w:rPr>
+        <w:lastRenderedPageBreak/>
         <w:t>Continuous Improvement:</w:t>
       </w:r>
       <w:r>
@@ -1019,7 +1071,21 @@
         <w:rPr>
           <w:rFonts w:ascii="Garamond" w:hAnsi="Garamond"/>
         </w:rPr>
-        <w:t> Daily cement consumption, planned pour quantities, and site-specific silo capacities.</w:t>
+        <w:t> </w:t>
+      </w:r>
+      <w:proofErr w:type="gramStart"/>
+      <w:r>
+        <w:rPr>
+          <w:rFonts w:ascii="Garamond" w:hAnsi="Garamond"/>
+        </w:rPr>
+        <w:t>Daily cement consumption,</w:t>
+      </w:r>
+      <w:proofErr w:type="gramEnd"/>
+      <w:r>
+        <w:rPr>
+          <w:rFonts w:ascii="Garamond" w:hAnsi="Garamond"/>
+        </w:rPr>
+        <w:t xml:space="preserve"> planned pour quantities, and site-specific silo capacities.</w:t>
       </w:r>
     </w:p>
     <w:p>
@@ -1084,7 +1150,6 @@
           <w:b/>
           <w:bCs/>
         </w:rPr>
-        <w:lastRenderedPageBreak/>
         <w:t>Data Sources:</w:t>
       </w:r>
     </w:p>
@@ -1119,7 +1184,21 @@
         <w:rPr>
           <w:rFonts w:ascii="Garamond" w:hAnsi="Garamond"/>
         </w:rPr>
-        <w:t>Project management systems (planned pour schedules).</w:t>
+        <w:t xml:space="preserve">Project management systems (planned </w:t>
+      </w:r>
+      <w:proofErr w:type="gramStart"/>
+      <w:r>
+        <w:rPr>
+          <w:rFonts w:ascii="Garamond" w:hAnsi="Garamond"/>
+        </w:rPr>
+        <w:t>pour schedules</w:t>
+      </w:r>
+      <w:proofErr w:type="gramEnd"/>
+      <w:r>
+        <w:rPr>
+          <w:rFonts w:ascii="Garamond" w:hAnsi="Garamond"/>
+        </w:rPr>
+        <w:t>).</w:t>
       </w:r>
     </w:p>
     <w:p>
@@ -1136,6 +1215,7 @@
         <w:rPr>
           <w:rFonts w:ascii="Garamond" w:hAnsi="Garamond"/>
         </w:rPr>
+        <w:lastRenderedPageBreak/>
         <w:t>Inventory management spreadsheets (stock positions).</w:t>
       </w:r>
     </w:p>
@@ -2336,7 +2416,6 @@
               <w:rPr>
                 <w:rFonts w:ascii="Garamond" w:hAnsi="Garamond"/>
               </w:rPr>
-              <w:lastRenderedPageBreak/>
               <w:t>rain_mm</w:t>
             </w:r>
             <w:proofErr w:type="spellEnd"/>
@@ -2537,6 +2616,7 @@
               <w:rPr>
                 <w:rFonts w:ascii="Garamond" w:hAnsi="Garamond"/>
               </w:rPr>
+              <w:lastRenderedPageBreak/>
               <w:t>silo_capacity</w:t>
             </w:r>
             <w:proofErr w:type="spellEnd"/>
@@ -2891,7 +2971,21 @@
         <w:rPr>
           <w:rFonts w:ascii="Garamond" w:hAnsi="Garamond"/>
         </w:rPr>
-        <w:t>Historical data must maintain consistent schema across time periods.</w:t>
+        <w:t xml:space="preserve">Historical data must maintain consistent </w:t>
+      </w:r>
+      <w:proofErr w:type="gramStart"/>
+      <w:r>
+        <w:rPr>
+          <w:rFonts w:ascii="Garamond" w:hAnsi="Garamond"/>
+        </w:rPr>
+        <w:t>schema</w:t>
+      </w:r>
+      <w:proofErr w:type="gramEnd"/>
+      <w:r>
+        <w:rPr>
+          <w:rFonts w:ascii="Garamond" w:hAnsi="Garamond"/>
+        </w:rPr>
+        <w:t xml:space="preserve"> across time periods.</w:t>
       </w:r>
     </w:p>
     <w:p>
@@ -3219,7 +3313,6 @@
               <w:rPr>
                 <w:rFonts w:ascii="Garamond" w:hAnsi="Garamond"/>
               </w:rPr>
-              <w:lastRenderedPageBreak/>
               <w:t>Data Processing</w:t>
             </w:r>
           </w:p>
@@ -3332,6 +3425,7 @@
               <w:rPr>
                 <w:rFonts w:ascii="Garamond" w:hAnsi="Garamond"/>
               </w:rPr>
+              <w:lastRenderedPageBreak/>
               <w:t>Machine Learning</w:t>
             </w:r>
           </w:p>
@@ -3663,7 +3757,21 @@
           <w:rFonts w:ascii="Garamond" w:hAnsi="Garamond"/>
         </w:rPr>
         <w:br/>
-        <w:t>Import site data from SQLite into Python pandas environment. Validate schema consistency, handle missing values, fix negative inventory or consumption entries, and ensure inventory flow balance equations hold across all records.</w:t>
+        <w:t xml:space="preserve">Import site data from SQLite into Python </w:t>
+      </w:r>
+      <w:proofErr w:type="gramStart"/>
+      <w:r>
+        <w:rPr>
+          <w:rFonts w:ascii="Garamond" w:hAnsi="Garamond"/>
+        </w:rPr>
+        <w:t>pandas</w:t>
+      </w:r>
+      <w:proofErr w:type="gramEnd"/>
+      <w:r>
+        <w:rPr>
+          <w:rFonts w:ascii="Garamond" w:hAnsi="Garamond"/>
+        </w:rPr>
+        <w:t xml:space="preserve"> environment. Validate schema consistency, handle missing values, fix negative inventory or consumption entries, and ensure inventory flow balance equations hold across all records.</w:t>
       </w:r>
     </w:p>
     <w:p>
@@ -3729,7 +3837,21 @@
           <w:rFonts w:ascii="Garamond" w:hAnsi="Garamond"/>
         </w:rPr>
         <w:br/>
-        <w:t>Baseline model using SARIMAX with external regressors. Compare against machine learning approaches including Random Forest with exogenous variables. Evaluate and select best-performing model using MAPE and RMSE metrics.</w:t>
+        <w:t xml:space="preserve">Baseline model using SARIMAX with external regressors. </w:t>
+      </w:r>
+      <w:proofErr w:type="gramStart"/>
+      <w:r>
+        <w:rPr>
+          <w:rFonts w:ascii="Garamond" w:hAnsi="Garamond"/>
+        </w:rPr>
+        <w:t>Compare against</w:t>
+      </w:r>
+      <w:proofErr w:type="gramEnd"/>
+      <w:r>
+        <w:rPr>
+          <w:rFonts w:ascii="Garamond" w:hAnsi="Garamond"/>
+        </w:rPr>
+        <w:t xml:space="preserve"> machine learning approaches including Random Forest with exogenous variables. Evaluate and select best-performing model using MAPE and RMSE metrics.</w:t>
       </w:r>
     </w:p>
     <w:p>
@@ -3766,7 +3888,6 @@
           <w:b/>
           <w:bCs/>
         </w:rPr>
-        <w:lastRenderedPageBreak/>
         <w:t>Step 6: Dashboard Application</w:t>
       </w:r>
       <w:r>
@@ -3803,6 +3924,7 @@
           <w:b/>
           <w:bCs/>
         </w:rPr>
+        <w:lastRenderedPageBreak/>
         <w:t>Step 7: Validation and Deployment</w:t>
       </w:r>
       <w:r>

</xml_diff>